<commit_message>
update scope of work document
update scope of work document
</commit_message>
<xml_diff>
--- a/Scope_of_Work_MydemoApp.docx
+++ b/Scope_of_Work_MydemoApp.docx
@@ -1,6 +1,6 @@
 
 <file path=word/document.xml><?xml version="1.0" encoding="utf-8"?>
-<w:document xmlns:wpc="http://schemas.microsoft.com/office/word/2010/wordprocessingCanvas" xmlns:cx="http://schemas.microsoft.com/office/drawing/2014/chartex" xmlns:cx1="http://schemas.microsoft.com/office/drawing/2015/9/8/chartex" xmlns:cx2="http://schemas.microsoft.com/office/drawing/2015/10/21/chartex" xmlns:cx3="http://schemas.microsoft.com/office/drawing/2016/5/9/chartex" xmlns:cx4="http://schemas.microsoft.com/office/drawing/2016/5/10/chartex" xmlns:cx5="http://schemas.microsoft.com/office/drawing/2016/5/11/chartex" xmlns:cx6="http://schemas.microsoft.com/office/drawing/2016/5/12/chartex" xmlns:cx7="http://schemas.microsoft.com/office/drawing/2016/5/13/chartex" xmlns:cx8="http://schemas.microsoft.com/office/drawing/2016/5/14/chartex" xmlns:mc="http://schemas.openxmlformats.org/markup-compatibility/2006" xmlns:aink="http://schemas.microsoft.com/office/drawing/2016/ink" xmlns:am3d="http://schemas.microsoft.com/office/drawing/2017/model3d" xmlns:o="urn:schemas-microsoft-com:office:office" xmlns:oel="http://schemas.microsoft.com/office/2019/extlst" xmlns:r="http://schemas.openxmlformats.org/officeDocument/2006/relationships" xmlns:m="http://schemas.openxmlformats.org/officeDocument/2006/math" xmlns:v="urn:schemas-microsoft-com:vml" xmlns:wp14="http://schemas.microsoft.com/office/word/2010/wordprocessingDrawing" xmlns:wp="http://schemas.openxmlformats.org/drawingml/2006/wordprocessingDrawing" xmlns:w10="urn:schemas-microsoft-com:office:word" xmlns:w="http://schemas.openxmlformats.org/wordprocessingml/2006/main" xmlns:w14="http://schemas.microsoft.com/office/word/2010/wordml" xmlns:w15="http://schemas.microsoft.com/office/word/2012/wordml" xmlns:w16cex="http://schemas.microsoft.com/office/word/2018/wordml/cex" xmlns:w16cid="http://schemas.microsoft.com/office/word/2016/wordml/cid" xmlns:w16="http://schemas.microsoft.com/office/word/2018/wordml" xmlns:w16du="http://schemas.microsoft.com/office/word/2023/wordml/word16du" xmlns:w16sdtdh="http://schemas.microsoft.com/office/word/2020/wordml/sdtdatahash" xmlns:w16sdtfl="http://schemas.microsoft.com/office/word/2024/wordml/sdtformatlock" xmlns:w16se="http://schemas.microsoft.com/office/word/2015/wordml/symex" xmlns:wpg="http://schemas.microsoft.com/office/word/2010/wordprocessingGroup" xmlns:wpi="http://schemas.microsoft.com/office/word/2010/wordprocessingInk" xmlns:wne="http://schemas.microsoft.com/office/word/2006/wordml" xmlns:wps="http://schemas.microsoft.com/office/word/2010/wordprocessingShape" mc:Ignorable="w14 w15 w16se w16cid w16 w16cex w16sdtdh w16sdtfl w16du wp14">
+<w:document xmlns:wpc="http://schemas.microsoft.com/office/word/2010/wordprocessingCanvas" xmlns:cx="http://schemas.microsoft.com/office/drawing/2014/chartex" xmlns:cx1="http://schemas.microsoft.com/office/drawing/2015/9/8/chartex" xmlns:cx2="http://schemas.microsoft.com/office/drawing/2015/10/21/chartex" xmlns:cx3="http://schemas.microsoft.com/office/drawing/2016/5/9/chartex" xmlns:cx4="http://schemas.microsoft.com/office/drawing/2016/5/10/chartex" xmlns:cx5="http://schemas.microsoft.com/office/drawing/2016/5/11/chartex" xmlns:cx6="http://schemas.microsoft.com/office/drawing/2016/5/12/chartex" xmlns:cx7="http://schemas.microsoft.com/office/drawing/2016/5/13/chartex" xmlns:cx8="http://schemas.microsoft.com/office/drawing/2016/5/14/chartex" xmlns:mc="http://schemas.openxmlformats.org/markup-compatibility/2006" xmlns:aink="http://schemas.microsoft.com/office/drawing/2016/ink" xmlns:am3d="http://schemas.microsoft.com/office/drawing/2017/model3d" xmlns:o="urn:schemas-microsoft-com:office:office" xmlns:oel="http://schemas.microsoft.com/office/2019/extlst" xmlns:r="http://schemas.openxmlformats.org/officeDocument/2006/relationships" xmlns:m="http://schemas.openxmlformats.org/officeDocument/2006/math" xmlns:v="urn:schemas-microsoft-com:vml" xmlns:wp14="http://schemas.microsoft.com/office/word/2010/wordprocessingDrawing" xmlns:wp="http://schemas.openxmlformats.org/drawingml/2006/wordprocessingDrawing" xmlns:w10="urn:schemas-microsoft-com:office:word" xmlns:w="http://schemas.openxmlformats.org/wordprocessingml/2006/main" xmlns:w14="http://schemas.microsoft.com/office/word/2010/wordml" xmlns:w15="http://schemas.microsoft.com/office/word/2012/wordml" xmlns:w16cei="http://schemas.microsoft.com/office/word/2026/wordml/cei" xmlns:w16cex="http://schemas.microsoft.com/office/word/2018/wordml/cex" xmlns:w16cid="http://schemas.microsoft.com/office/word/2016/wordml/cid" xmlns:w16="http://schemas.microsoft.com/office/word/2018/wordml" xmlns:w16du="http://schemas.microsoft.com/office/word/2023/wordml/word16du" xmlns:w16sdtdh="http://schemas.microsoft.com/office/word/2020/wordml/sdtdatahash" xmlns:w16sdtfl="http://schemas.microsoft.com/office/word/2024/wordml/sdtformatlock" xmlns:w16se="http://schemas.microsoft.com/office/word/2015/wordml/symex" xmlns:wpg="http://schemas.microsoft.com/office/word/2010/wordprocessingGroup" xmlns:wpi="http://schemas.microsoft.com/office/word/2010/wordprocessingInk" xmlns:wne="http://schemas.microsoft.com/office/word/2006/wordml" xmlns:wps="http://schemas.microsoft.com/office/word/2010/wordprocessingShape" mc:Ignorable="w14 w15 w16se w16cid w16 w16cex w16sdtdh w16sdtfl w16du wp14">
   <w:body>
     <w:p>
       <w:pPr>
@@ -16,6 +16,9 @@
     <w:p>
       <w:pPr>
         <w:pStyle w:val="Heading1"/>
+        <w:tabs>
+          <w:tab w:val="left" w:pos="552"/>
+        </w:tabs>
         <w:jc w:val="center"/>
       </w:pPr>
       <w:r>
@@ -28,7 +31,6 @@
         <w:t>(SAMPLE DOCUMENT)</w:t>
       </w:r>
     </w:p>
-    <w:p/>
     <w:p/>
     <w:tbl>
       <w:tblPr>
@@ -37,13 +39,13 @@
         <w:tblLook w:val="04A0" w:firstRow="1" w:lastRow="0" w:firstColumn="1" w:lastColumn="0" w:noHBand="0" w:noVBand="1"/>
       </w:tblPr>
       <w:tblGrid>
-        <w:gridCol w:w="4509"/>
-        <w:gridCol w:w="4507"/>
+        <w:gridCol w:w="3259"/>
+        <w:gridCol w:w="5757"/>
       </w:tblGrid>
       <w:tr>
         <w:tc>
           <w:tcPr>
-            <w:tcW w:w="4509" w:type="dxa"/>
+            <w:tcW w:w="3259" w:type="dxa"/>
           </w:tcPr>
           <w:p>
             <w:r>
@@ -53,7 +55,7 @@
         </w:tc>
         <w:tc>
           <w:tcPr>
-            <w:tcW w:w="4507" w:type="dxa"/>
+            <w:tcW w:w="5757" w:type="dxa"/>
           </w:tcPr>
           <w:p>
             <w:r>
@@ -65,7 +67,7 @@
       <w:tr>
         <w:tc>
           <w:tcPr>
-            <w:tcW w:w="4509" w:type="dxa"/>
+            <w:tcW w:w="3259" w:type="dxa"/>
           </w:tcPr>
           <w:p>
             <w:r>
@@ -75,11 +77,11 @@
         </w:tc>
         <w:tc>
           <w:tcPr>
-            <w:tcW w:w="4507" w:type="dxa"/>
+            <w:tcW w:w="5757" w:type="dxa"/>
           </w:tcPr>
           <w:p>
             <w:r>
-              <w:t>Scope_of_Work_MydemoApp</w:t>
+              <w:t>Scope_of_Work_MydemoApp_sample_template</w:t>
             </w:r>
             <w:r>
               <w:t>.docx</w:t>
@@ -90,7 +92,7 @@
       <w:tr>
         <w:tc>
           <w:tcPr>
-            <w:tcW w:w="4509" w:type="dxa"/>
+            <w:tcW w:w="3259" w:type="dxa"/>
           </w:tcPr>
           <w:p>
             <w:r>
@@ -103,7 +105,7 @@
         </w:tc>
         <w:tc>
           <w:tcPr>
-            <w:tcW w:w="4507" w:type="dxa"/>
+            <w:tcW w:w="5757" w:type="dxa"/>
           </w:tcPr>
           <w:p>
             <w:r>
@@ -115,7 +117,7 @@
       <w:tr>
         <w:tc>
           <w:tcPr>
-            <w:tcW w:w="4509" w:type="dxa"/>
+            <w:tcW w:w="3259" w:type="dxa"/>
           </w:tcPr>
           <w:p>
             <w:r>
@@ -125,7 +127,7 @@
         </w:tc>
         <w:tc>
           <w:tcPr>
-            <w:tcW w:w="4507" w:type="dxa"/>
+            <w:tcW w:w="5757" w:type="dxa"/>
           </w:tcPr>
           <w:p>
             <w:r>
@@ -137,7 +139,7 @@
       <w:tr>
         <w:tc>
           <w:tcPr>
-            <w:tcW w:w="4509" w:type="dxa"/>
+            <w:tcW w:w="3259" w:type="dxa"/>
           </w:tcPr>
           <w:p>
             <w:r>
@@ -150,7 +152,7 @@
         </w:tc>
         <w:tc>
           <w:tcPr>
-            <w:tcW w:w="4507" w:type="dxa"/>
+            <w:tcW w:w="5757" w:type="dxa"/>
           </w:tcPr>
           <w:p>
             <w:r>
@@ -162,7 +164,7 @@
       <w:tr>
         <w:tc>
           <w:tcPr>
-            <w:tcW w:w="4509" w:type="dxa"/>
+            <w:tcW w:w="3259" w:type="dxa"/>
           </w:tcPr>
           <w:p>
             <w:r>
@@ -172,7 +174,7 @@
         </w:tc>
         <w:tc>
           <w:tcPr>
-            <w:tcW w:w="4507" w:type="dxa"/>
+            <w:tcW w:w="5757" w:type="dxa"/>
           </w:tcPr>
           <w:p>
             <w:r>
@@ -184,7 +186,7 @@
       <w:tr>
         <w:tc>
           <w:tcPr>
-            <w:tcW w:w="4509" w:type="dxa"/>
+            <w:tcW w:w="3259" w:type="dxa"/>
           </w:tcPr>
           <w:p>
             <w:r>
@@ -194,7 +196,7 @@
         </w:tc>
         <w:tc>
           <w:tcPr>
-            <w:tcW w:w="4507" w:type="dxa"/>
+            <w:tcW w:w="5757" w:type="dxa"/>
           </w:tcPr>
           <w:p>
             <w:r>
@@ -225,15 +227,22 @@
     <w:p/>
     <w:p>
       <w:pPr>
-        <w:pStyle w:val="Heading3"/>
-      </w:pPr>
-      <w:r>
+        <w:pStyle w:val="Heading1"/>
+      </w:pPr>
+      <w:r>
+        <w:lastRenderedPageBreak/>
         <w:t>Introduction:</w:t>
       </w:r>
     </w:p>
     <w:p>
       <w:r>
-        <w:t>This is a sample Scope of Work document created for illustrative purposes only. The content does not relate to a</w:t>
+        <w:t xml:space="preserve">This is a sample Scope of Work document created for illustrative </w:t>
+      </w:r>
+      <w:r>
+        <w:t xml:space="preserve">and portfolio demonstration </w:t>
+      </w:r>
+      <w:r>
+        <w:t>purposes only. The content does not relate to a</w:t>
       </w:r>
       <w:r>
         <w:t>ny</w:t>
@@ -242,7 +251,13 @@
         <w:t xml:space="preserve"> real project or </w:t>
       </w:r>
       <w:r>
-        <w:t>agreement. This document can be tailored to meet customer requirements</w:t>
+        <w:t>agreement. This document can be tailored to meet customer</w:t>
+      </w:r>
+      <w:r>
+        <w:t>-</w:t>
+      </w:r>
+      <w:r>
+        <w:t>specific requirements</w:t>
       </w:r>
       <w:r>
         <w:t>.</w:t>
@@ -250,7 +265,7 @@
     </w:p>
     <w:p>
       <w:pPr>
-        <w:pStyle w:val="Heading3"/>
+        <w:pStyle w:val="Heading1"/>
       </w:pPr>
       <w:r>
         <w:t xml:space="preserve">Project Overview: </w:t>
@@ -258,182 +273,254 @@
     </w:p>
     <w:p>
       <w:r>
-        <w:t xml:space="preserve">Sauce Labs “MY DEMO APP” is a public repository </w:t>
-      </w:r>
-      <w:r>
-        <w:t xml:space="preserve">available </w:t>
-      </w:r>
-      <w:r>
-        <w:t xml:space="preserve">on </w:t>
-      </w:r>
-      <w:r>
-        <w:t>GitHub, used</w:t>
-      </w:r>
-      <w:r>
-        <w:t xml:space="preserve"> to demonstrate testing skills </w:t>
-      </w:r>
-      <w:r>
-        <w:t>in this</w:t>
-      </w:r>
-      <w:r>
-        <w:t xml:space="preserve"> portfolio project</w:t>
-      </w:r>
-      <w:r>
-        <w:t>.</w:t>
-      </w:r>
-      <w:r>
-        <w:t xml:space="preserve"> </w:t>
-      </w:r>
-      <w:r>
-        <w:t xml:space="preserve">The application </w:t>
-      </w:r>
-      <w:r>
-        <w:t>contains various</w:t>
-      </w:r>
-      <w:r>
-        <w:t xml:space="preserve"> categories for</w:t>
-      </w:r>
-      <w:r>
-        <w:t xml:space="preserve"> testing</w:t>
-      </w:r>
-      <w:r>
-        <w:t xml:space="preserve"> purposes</w:t>
-      </w:r>
-      <w:r>
-        <w:t xml:space="preserve"> and include</w:t>
-      </w:r>
-      <w:r>
-        <w:t>s</w:t>
-      </w:r>
-      <w:r>
-        <w:t xml:space="preserve"> real</w:t>
-      </w:r>
-      <w:r>
-        <w:t>-</w:t>
-      </w:r>
-      <w:r>
-        <w:t xml:space="preserve">world simulated features. </w:t>
-      </w:r>
-      <w:r>
-        <w:t>In this project</w:t>
-      </w:r>
-      <w:r>
-        <w:t>,</w:t>
-      </w:r>
-      <w:r>
-        <w:t xml:space="preserve"> </w:t>
-      </w:r>
-      <w:r>
-        <w:t xml:space="preserve">the </w:t>
-      </w:r>
-      <w:r>
-        <w:t xml:space="preserve">e-commerce </w:t>
-      </w:r>
-      <w:r>
-        <w:t>category is used</w:t>
-      </w:r>
-      <w:r>
-        <w:t xml:space="preserve"> to showcase</w:t>
-      </w:r>
-      <w:r>
-        <w:t xml:space="preserve"> </w:t>
-      </w:r>
-      <w:r>
-        <w:t>different types of testing.</w:t>
-      </w:r>
-    </w:p>
-    <w:p>
-      <w:pPr>
-        <w:pStyle w:val="Heading3"/>
-      </w:pPr>
-      <w:r>
-        <w:t>Test Approach:</w:t>
-      </w:r>
-    </w:p>
-    <w:p>
-      <w:r>
-        <w:t xml:space="preserve">As there </w:t>
-      </w:r>
-      <w:proofErr w:type="gramStart"/>
-      <w:r>
-        <w:t>is</w:t>
-      </w:r>
-      <w:proofErr w:type="gramEnd"/>
-      <w:r>
-        <w:t xml:space="preserve"> no</w:t>
-      </w:r>
-      <w:r>
-        <w:t xml:space="preserve"> </w:t>
-      </w:r>
-      <w:r>
-        <w:t>formal</w:t>
-      </w:r>
-      <w:r>
-        <w:t xml:space="preserve"> requirements specification document</w:t>
-      </w:r>
-      <w:r>
-        <w:t xml:space="preserve"> available</w:t>
-      </w:r>
-      <w:r>
-        <w:t xml:space="preserve">, </w:t>
-      </w:r>
-      <w:r>
-        <w:t>exploratory test</w:t>
-      </w:r>
-      <w:r>
-        <w:t>ing</w:t>
-      </w:r>
-      <w:r>
-        <w:t xml:space="preserve"> techniques </w:t>
-      </w:r>
-      <w:r>
-        <w:t>will be used</w:t>
-      </w:r>
-      <w:r>
-        <w:t xml:space="preserve"> to </w:t>
-      </w:r>
-      <w:r>
-        <w:t>validate</w:t>
-      </w:r>
-      <w:r>
-        <w:t xml:space="preserve"> the e-commerce features. </w:t>
-      </w:r>
-      <w:r>
-        <w:t>Key</w:t>
-      </w:r>
-      <w:r>
-        <w:t xml:space="preserve"> user journeys are </w:t>
-      </w:r>
-      <w:r>
-        <w:t xml:space="preserve">validated </w:t>
-      </w:r>
-      <w:r>
-        <w:t>by exploring the application.</w:t>
-      </w:r>
-    </w:p>
-    <w:p>
-      <w:pPr>
-        <w:pStyle w:val="Heading3"/>
-      </w:pPr>
-      <w:r>
-        <w:t>In-Scope</w:t>
-      </w:r>
-      <w:r>
-        <w:t>:</w:t>
-      </w:r>
-    </w:p>
-    <w:p>
-      <w:pPr>
+        <w:t xml:space="preserve">Sauce Labs </w:t>
+      </w:r>
+      <w:r>
         <w:rPr>
           <w:b/>
           <w:bCs/>
         </w:rPr>
+        <w:t>MY DEMO APP</w:t>
+      </w:r>
+      <w:r>
+        <w:t xml:space="preserve"> is a public</w:t>
+      </w:r>
+      <w:r>
+        <w:t xml:space="preserve">ly </w:t>
+      </w:r>
+      <w:r>
+        <w:t xml:space="preserve">available </w:t>
+      </w:r>
+      <w:r>
+        <w:t xml:space="preserve">android app </w:t>
+      </w:r>
+      <w:r>
+        <w:t xml:space="preserve">on </w:t>
+      </w:r>
+      <w:r>
+        <w:t>GitHub and</w:t>
+      </w:r>
+      <w:r>
+        <w:t xml:space="preserve"> is </w:t>
+      </w:r>
+      <w:r>
+        <w:t>used</w:t>
+      </w:r>
+      <w:r>
+        <w:t xml:space="preserve"> </w:t>
+      </w:r>
+      <w:r>
+        <w:t xml:space="preserve">in this portfolio project </w:t>
+      </w:r>
+      <w:r>
+        <w:t xml:space="preserve">to </w:t>
+      </w:r>
+      <w:r>
+        <w:t xml:space="preserve">demonstrate </w:t>
+      </w:r>
+      <w:r>
+        <w:t xml:space="preserve">software </w:t>
+      </w:r>
+      <w:r>
+        <w:t>testing skills</w:t>
+      </w:r>
+      <w:r>
+        <w:t>.</w:t>
+      </w:r>
+      <w:r>
+        <w:t xml:space="preserve"> </w:t>
+      </w:r>
+      <w:r>
+        <w:t xml:space="preserve">The application </w:t>
+      </w:r>
+      <w:r>
+        <w:t>contains various</w:t>
+      </w:r>
+      <w:r>
+        <w:t xml:space="preserve"> categories for</w:t>
+      </w:r>
+      <w:r>
+        <w:t xml:space="preserve"> testing</w:t>
+      </w:r>
+      <w:r>
+        <w:t xml:space="preserve"> purposes</w:t>
+      </w:r>
+      <w:r>
+        <w:t xml:space="preserve"> and include</w:t>
+      </w:r>
+      <w:r>
+        <w:t>s</w:t>
+      </w:r>
+      <w:r>
+        <w:t xml:space="preserve"> </w:t>
+      </w:r>
+      <w:r>
+        <w:t xml:space="preserve">features that simulate </w:t>
+      </w:r>
+      <w:r>
+        <w:t>real</w:t>
+      </w:r>
+      <w:r>
+        <w:t>-</w:t>
+      </w:r>
+      <w:r>
+        <w:t xml:space="preserve">world </w:t>
+      </w:r>
+      <w:r>
+        <w:t>e-commerce scenarios.</w:t>
+      </w:r>
+      <w:r>
+        <w:t xml:space="preserve"> </w:t>
+      </w:r>
+    </w:p>
+    <w:p>
+      <w:r>
+        <w:t xml:space="preserve">For </w:t>
+      </w:r>
+      <w:r>
+        <w:t>this project</w:t>
+      </w:r>
+      <w:r>
+        <w:t>,</w:t>
+      </w:r>
+      <w:r>
+        <w:t xml:space="preserve"> </w:t>
+      </w:r>
+      <w:r>
+        <w:t xml:space="preserve">the </w:t>
+      </w:r>
+      <w:r>
+        <w:t xml:space="preserve">e-commerce </w:t>
+      </w:r>
+      <w:r>
+        <w:t xml:space="preserve">category </w:t>
+      </w:r>
+      <w:r>
+        <w:t>will be</w:t>
+      </w:r>
+      <w:r>
+        <w:t xml:space="preserve"> used</w:t>
+      </w:r>
+      <w:r>
+        <w:t xml:space="preserve"> to </w:t>
+      </w:r>
+      <w:r>
+        <w:t xml:space="preserve">demonstrate functional and UI </w:t>
+      </w:r>
+      <w:r>
+        <w:t>testing.</w:t>
+      </w:r>
+    </w:p>
+    <w:p>
+      <w:pPr>
+        <w:pStyle w:val="Heading1"/>
+      </w:pPr>
+      <w:r>
+        <w:t>Test Approach:</w:t>
+      </w:r>
+    </w:p>
+    <w:p>
+      <w:r>
+        <w:t xml:space="preserve">As </w:t>
+      </w:r>
+      <w:r>
+        <w:t>no</w:t>
+      </w:r>
+      <w:r>
+        <w:t xml:space="preserve"> </w:t>
+      </w:r>
+      <w:r>
+        <w:t>formal</w:t>
+      </w:r>
+      <w:r>
+        <w:t xml:space="preserve"> requirements specification document</w:t>
+      </w:r>
+      <w:r>
+        <w:t xml:space="preserve"> is available for this demonstration project</w:t>
+      </w:r>
+      <w:r>
+        <w:t xml:space="preserve">, </w:t>
+      </w:r>
+      <w:r>
+        <w:t>exploratory test</w:t>
+      </w:r>
+      <w:r>
+        <w:t>ing</w:t>
+      </w:r>
+      <w:r>
+        <w:t xml:space="preserve"> techniques </w:t>
+      </w:r>
+      <w:r>
+        <w:t>will be used</w:t>
+      </w:r>
+      <w:r>
+        <w:t xml:space="preserve"> to </w:t>
+      </w:r>
+      <w:r>
+        <w:t xml:space="preserve">identify and </w:t>
+      </w:r>
+      <w:r>
+        <w:t>validate</w:t>
+      </w:r>
+      <w:r>
+        <w:t xml:space="preserve"> </w:t>
+      </w:r>
+      <w:r>
+        <w:t xml:space="preserve">issues within </w:t>
+      </w:r>
+      <w:r>
+        <w:t xml:space="preserve">the </w:t>
+      </w:r>
+      <w:r>
+        <w:t>defined scope.</w:t>
+      </w:r>
+    </w:p>
+    <w:p>
+      <w:r>
+        <w:t>Key</w:t>
+      </w:r>
+      <w:r>
+        <w:t xml:space="preserve"> user journeys </w:t>
+      </w:r>
+      <w:r>
+        <w:t>and e-commerce features will be explored and</w:t>
+      </w:r>
+      <w:r>
+        <w:t xml:space="preserve"> </w:t>
+      </w:r>
+      <w:r>
+        <w:t xml:space="preserve">validated </w:t>
+      </w:r>
+      <w:r>
+        <w:t>from a functional and UI perspective.</w:t>
+      </w:r>
+    </w:p>
+    <w:p>
+      <w:pPr>
+        <w:pStyle w:val="Heading1"/>
+      </w:pPr>
+      <w:r>
+        <w:t>In-Scope</w:t>
+      </w:r>
+      <w:r>
+        <w:t>:</w:t>
+      </w:r>
+    </w:p>
+    <w:p>
+      <w:pPr>
+        <w:rPr>
+          <w:b/>
+          <w:bCs/>
+        </w:rPr>
       </w:pPr>
       <w:r>
         <w:t xml:space="preserve">Functional and UI testing </w:t>
       </w:r>
       <w:r>
         <w:t>will be performed for the following features</w:t>
+      </w:r>
+      <w:r>
+        <w:t>:</w:t>
       </w:r>
     </w:p>
     <w:p>
@@ -459,11 +546,9 @@
       <w:r>
         <w:t xml:space="preserve">Product </w:t>
       </w:r>
-      <w:proofErr w:type="spellStart"/>
       <w:r>
         <w:t>Catalog</w:t>
       </w:r>
-      <w:proofErr w:type="spellEnd"/>
     </w:p>
     <w:p>
       <w:pPr>
@@ -521,46 +606,46 @@
         <w:t xml:space="preserve">of </w:t>
       </w:r>
       <w:r>
-        <w:t>4</w:t>
+        <w:t xml:space="preserve">four </w:t>
+      </w:r>
+      <w:r>
+        <w:t>b</w:t>
+      </w:r>
+      <w:r>
+        <w:t xml:space="preserve">ug reports </w:t>
+      </w:r>
+      <w:r>
+        <w:t>will be created</w:t>
       </w:r>
       <w:r>
         <w:t xml:space="preserve"> </w:t>
       </w:r>
       <w:r>
+        <w:t xml:space="preserve">to </w:t>
+      </w:r>
+      <w:r>
+        <w:t>demonstrate</w:t>
+      </w:r>
+      <w:r>
+        <w:t xml:space="preserve"> different severity levels.</w:t>
+      </w:r>
+      <w:r>
+        <w:t xml:space="preserve"> </w:t>
+      </w:r>
+      <w:r>
+        <w:t xml:space="preserve">Each </w:t>
+      </w:r>
+      <w:r>
         <w:t>b</w:t>
       </w:r>
       <w:r>
-        <w:t xml:space="preserve">ug reports </w:t>
-      </w:r>
-      <w:r>
-        <w:t>will be created</w:t>
-      </w:r>
-      <w:r>
-        <w:t xml:space="preserve"> </w:t>
-      </w:r>
-      <w:r>
-        <w:t xml:space="preserve">to </w:t>
-      </w:r>
-      <w:r>
-        <w:t>demonstrate</w:t>
-      </w:r>
-      <w:r>
-        <w:t xml:space="preserve"> different severity levels.</w:t>
-      </w:r>
-      <w:r>
-        <w:t xml:space="preserve"> </w:t>
-      </w:r>
-      <w:r>
-        <w:t xml:space="preserve">Each </w:t>
-      </w:r>
-      <w:r>
-        <w:t>b</w:t>
-      </w:r>
-      <w:r>
         <w:t>ug report</w:t>
       </w:r>
       <w:r>
         <w:t xml:space="preserve"> will include</w:t>
+      </w:r>
+      <w:r>
+        <w:t>, where applicable:</w:t>
       </w:r>
     </w:p>
     <w:p>
@@ -584,16 +669,7 @@
         </w:numPr>
       </w:pPr>
       <w:r>
-        <w:t>S</w:t>
-      </w:r>
-      <w:r>
-        <w:t xml:space="preserve">creenshots </w:t>
-      </w:r>
-      <w:r>
-        <w:t>and/</w:t>
-      </w:r>
-      <w:r>
-        <w:t xml:space="preserve">or screen recordings </w:t>
+        <w:t>Expected and actual results</w:t>
       </w:r>
     </w:p>
     <w:p>
@@ -605,103 +681,16 @@
         </w:numPr>
       </w:pPr>
       <w:r>
-        <w:t>C</w:t>
-      </w:r>
-      <w:r>
-        <w:t xml:space="preserve">rash logs </w:t>
-      </w:r>
-      <w:r>
-        <w:t>(</w:t>
-      </w:r>
-      <w:r>
-        <w:t xml:space="preserve">if </w:t>
-      </w:r>
-      <w:r>
-        <w:t>applicable)</w:t>
-      </w:r>
-      <w:r>
-        <w:t xml:space="preserve"> </w:t>
-      </w:r>
-    </w:p>
-    <w:p>
-      <w:pPr>
-        <w:pStyle w:val="Heading3"/>
-      </w:pPr>
-      <w:r>
-        <w:t>Test Environment:</w:t>
-      </w:r>
-    </w:p>
-    <w:p>
-      <w:r>
-        <w:t>Android device in</w:t>
-      </w:r>
-      <w:r>
-        <w:t xml:space="preserve"> </w:t>
-      </w:r>
-      <w:r>
-        <w:t>scope</w:t>
-      </w:r>
-      <w:r>
-        <w:t>:</w:t>
-      </w:r>
-    </w:p>
-    <w:p>
-      <w:r>
-        <w:t>D</w:t>
-      </w:r>
-      <w:r>
-        <w:t>evice: Samsung Galaxy S22</w:t>
-      </w:r>
-    </w:p>
-    <w:p>
-      <w:r>
-        <w:t xml:space="preserve">OS: </w:t>
-      </w:r>
-      <w:r>
-        <w:t>Android</w:t>
-      </w:r>
-      <w:r>
-        <w:t xml:space="preserve"> 16</w:t>
-      </w:r>
-    </w:p>
-    <w:p>
-      <w:pPr>
-        <w:pStyle w:val="Heading3"/>
-      </w:pPr>
-      <w:r>
-        <w:t>Deliverables:</w:t>
-      </w:r>
-    </w:p>
-    <w:p>
-      <w:r>
-        <w:t xml:space="preserve">A set of </w:t>
-      </w:r>
-      <w:r>
-        <w:t>b</w:t>
-      </w:r>
-      <w:r>
-        <w:t xml:space="preserve">ug </w:t>
-      </w:r>
-      <w:r>
-        <w:t>r</w:t>
-      </w:r>
-      <w:r>
-        <w:t xml:space="preserve">eports </w:t>
-      </w:r>
-      <w:r>
-        <w:t xml:space="preserve">(minimum of </w:t>
-      </w:r>
-      <w:r>
-        <w:t>4</w:t>
-      </w:r>
-      <w:r>
-        <w:t>)</w:t>
-      </w:r>
-      <w:r>
-        <w:t xml:space="preserve"> each including</w:t>
-      </w:r>
-      <w:r>
-        <w:t>,</w:t>
+        <w:t>S</w:t>
+      </w:r>
+      <w:r>
+        <w:t xml:space="preserve">creenshots </w:t>
+      </w:r>
+      <w:r>
+        <w:t>and/</w:t>
+      </w:r>
+      <w:r>
+        <w:t xml:space="preserve">or screen recordings </w:t>
       </w:r>
     </w:p>
     <w:p>
@@ -709,20 +698,92 @@
         <w:pStyle w:val="ListParagraph"/>
         <w:numPr>
           <w:ilvl w:val="0"/>
-          <w:numId w:val="3"/>
+          <w:numId w:val="2"/>
         </w:numPr>
       </w:pPr>
       <w:r>
+        <w:t>C</w:t>
+      </w:r>
+      <w:r>
+        <w:t>rash logs</w:t>
+      </w:r>
+      <w:r>
+        <w:t>, i</w:t>
+      </w:r>
+      <w:r>
+        <w:t xml:space="preserve">f </w:t>
+      </w:r>
+      <w:r>
+        <w:t>applicable</w:t>
+      </w:r>
+      <w:r>
+        <w:t xml:space="preserve"> </w:t>
+      </w:r>
+    </w:p>
+    <w:p>
+      <w:pPr>
+        <w:pStyle w:val="Heading2"/>
+        <w:ind w:firstLine="360"/>
+      </w:pPr>
+      <w:r>
+        <w:lastRenderedPageBreak/>
+        <w:t>Test Environment:</w:t>
+      </w:r>
+    </w:p>
+    <w:p>
+      <w:pPr>
+        <w:rPr>
+          <w:b/>
+          <w:bCs/>
+        </w:rPr>
+      </w:pPr>
+      <w:r>
+        <w:rPr>
+          <w:b/>
+          <w:bCs/>
+        </w:rPr>
+        <w:t xml:space="preserve">       </w:t>
+      </w:r>
+      <w:r>
+        <w:rPr>
+          <w:b/>
+          <w:bCs/>
+        </w:rPr>
+        <w:t>Android device</w:t>
+      </w:r>
+    </w:p>
+    <w:p>
+      <w:r>
+        <w:t xml:space="preserve">        </w:t>
+      </w:r>
+      <w:r>
         <w:t>D</w:t>
       </w:r>
       <w:r>
-        <w:t xml:space="preserve">etailed </w:t>
-      </w:r>
-      <w:r>
-        <w:t xml:space="preserve">reproduction </w:t>
-      </w:r>
-      <w:r>
-        <w:t>steps</w:t>
+        <w:t>evice: Samsung Galaxy S22</w:t>
+      </w:r>
+    </w:p>
+    <w:p>
+      <w:r>
+        <w:t xml:space="preserve">        </w:t>
+      </w:r>
+      <w:r>
+        <w:t xml:space="preserve">OS: </w:t>
+      </w:r>
+      <w:r>
+        <w:t>Android</w:t>
+      </w:r>
+      <w:r>
+        <w:t xml:space="preserve"> 16</w:t>
+      </w:r>
+    </w:p>
+    <w:p>
+      <w:pPr>
+        <w:pStyle w:val="Heading2"/>
+        <w:ind w:firstLine="360"/>
+      </w:pPr>
+      <w:r>
+        <w:t>Deliverables:</w:t>
       </w:r>
     </w:p>
     <w:p>
@@ -730,21 +791,11 @@
         <w:pStyle w:val="ListParagraph"/>
         <w:numPr>
           <w:ilvl w:val="0"/>
-          <w:numId w:val="3"/>
+          <w:numId w:val="8"/>
         </w:numPr>
       </w:pPr>
       <w:r>
-        <w:lastRenderedPageBreak/>
-        <w:t>Evidence- s</w:t>
-      </w:r>
-      <w:r>
-        <w:t xml:space="preserve">creenshots </w:t>
-      </w:r>
-      <w:r>
-        <w:t>and/</w:t>
-      </w:r>
-      <w:r>
-        <w:t>or screen recording</w:t>
+        <w:t>Scope of Work (SOW) document</w:t>
       </w:r>
     </w:p>
     <w:p>
@@ -752,28 +803,40 @@
         <w:pStyle w:val="ListParagraph"/>
         <w:numPr>
           <w:ilvl w:val="0"/>
-          <w:numId w:val="3"/>
+          <w:numId w:val="8"/>
         </w:numPr>
       </w:pPr>
       <w:r>
-        <w:t>C</w:t>
-      </w:r>
-      <w:r>
-        <w:t xml:space="preserve">rash </w:t>
-      </w:r>
-      <w:r>
-        <w:t>logs (</w:t>
-      </w:r>
-      <w:r>
-        <w:t>if</w:t>
-      </w:r>
-      <w:r>
-        <w:t xml:space="preserve"> applicable)</w:t>
-      </w:r>
-    </w:p>
-    <w:p>
-      <w:pPr>
-        <w:pStyle w:val="Heading3"/>
+        <w:t xml:space="preserve">A set of </w:t>
+      </w:r>
+      <w:r>
+        <w:t>b</w:t>
+      </w:r>
+      <w:r>
+        <w:t xml:space="preserve">ug </w:t>
+      </w:r>
+      <w:r>
+        <w:t>r</w:t>
+      </w:r>
+      <w:r>
+        <w:t xml:space="preserve">eports </w:t>
+      </w:r>
+      <w:r>
+        <w:t xml:space="preserve">(minimum of </w:t>
+      </w:r>
+      <w:r>
+        <w:t>4</w:t>
+      </w:r>
+      <w:r>
+        <w:t>)</w:t>
+      </w:r>
+      <w:r>
+        <w:t xml:space="preserve"> </w:t>
+      </w:r>
+    </w:p>
+    <w:p>
+      <w:pPr>
+        <w:pStyle w:val="Heading1"/>
       </w:pPr>
       <w:r>
         <w:t>Out of Scope</w:t>
@@ -784,36 +847,12 @@
     </w:p>
     <w:p>
       <w:r>
-        <w:t>Any items</w:t>
-      </w:r>
-      <w:r>
-        <w:t xml:space="preserve"> </w:t>
-      </w:r>
-      <w:r>
-        <w:t>or</w:t>
-      </w:r>
-      <w:r>
-        <w:t xml:space="preserve"> activities not explicitly mentioned in the in-scope </w:t>
-      </w:r>
-      <w:r>
-        <w:t xml:space="preserve">section </w:t>
-      </w:r>
-      <w:r>
-        <w:t xml:space="preserve">are </w:t>
-      </w:r>
-      <w:r>
-        <w:t xml:space="preserve">considered out of </w:t>
-      </w:r>
-      <w:r>
-        <w:t>s</w:t>
-      </w:r>
-      <w:r>
-        <w:t>cope.</w:t>
-      </w:r>
-    </w:p>
-    <w:p>
-      <w:pPr>
-        <w:pStyle w:val="Heading3"/>
+        <w:t>Any items, features, or activities not explicitly identified in the In-scope section are considered out of scope for this demonstration project.</w:t>
+      </w:r>
+    </w:p>
+    <w:p>
+      <w:pPr>
+        <w:pStyle w:val="Heading1"/>
       </w:pPr>
       <w:r>
         <w:t>Assumptions:</w:t>
@@ -828,7 +867,16 @@
         </w:numPr>
       </w:pPr>
       <w:r>
-        <w:t>The application will remain stable during testing</w:t>
+        <w:t>The application will remain</w:t>
+      </w:r>
+      <w:r>
+        <w:t xml:space="preserve"> accessible and </w:t>
+      </w:r>
+      <w:r>
+        <w:t>testable throughout</w:t>
+      </w:r>
+      <w:r>
+        <w:t xml:space="preserve"> the testing activities.</w:t>
       </w:r>
     </w:p>
     <w:p>
@@ -840,7 +888,22 @@
         </w:numPr>
       </w:pPr>
       <w:r>
-        <w:t>No major changes will be introduced during execution</w:t>
+        <w:t xml:space="preserve">No major </w:t>
+      </w:r>
+      <w:r>
+        <w:t xml:space="preserve">application </w:t>
+      </w:r>
+      <w:r>
+        <w:t xml:space="preserve">changes will be introduced during </w:t>
+      </w:r>
+      <w:r>
+        <w:t xml:space="preserve">testing </w:t>
+      </w:r>
+      <w:r>
+        <w:t>activities</w:t>
+      </w:r>
+      <w:r>
+        <w:t>.</w:t>
       </w:r>
     </w:p>
     <w:p>
@@ -852,12 +915,36 @@
         </w:numPr>
       </w:pPr>
       <w:r>
-        <w:t>Required access to the application is available throughout the testing</w:t>
-      </w:r>
-    </w:p>
-    <w:p>
-      <w:pPr>
-        <w:pStyle w:val="Heading3"/>
+        <w:t xml:space="preserve">Required access to the application </w:t>
+      </w:r>
+      <w:r>
+        <w:t>will</w:t>
+      </w:r>
+      <w:r>
+        <w:t xml:space="preserve"> </w:t>
+      </w:r>
+      <w:r>
+        <w:t xml:space="preserve">be </w:t>
+      </w:r>
+      <w:r>
+        <w:t>available throughout the testing</w:t>
+      </w:r>
+    </w:p>
+    <w:p>
+      <w:pPr>
+        <w:pStyle w:val="ListParagraph"/>
+        <w:numPr>
+          <w:ilvl w:val="0"/>
+          <w:numId w:val="7"/>
+        </w:numPr>
+      </w:pPr>
+      <w:r>
+        <w:t>The defined testing environment will be available for testing activities</w:t>
+      </w:r>
+    </w:p>
+    <w:p>
+      <w:pPr>
+        <w:pStyle w:val="Heading1"/>
       </w:pPr>
       <w:r>
         <w:t>Acceptance Criteria</w:t>
@@ -876,7 +963,7 @@
     </w:p>
     <w:p>
       <w:pPr>
-        <w:pStyle w:val="Heading3"/>
+        <w:pStyle w:val="Heading2"/>
       </w:pPr>
       <w:r>
         <w:t>Note:</w:t>
@@ -898,7 +985,7 @@
 </file>
 
 <file path=word/endnotes.xml><?xml version="1.0" encoding="utf-8"?>
-<w:endnotes xmlns:wpc="http://schemas.microsoft.com/office/word/2010/wordprocessingCanvas" xmlns:cx="http://schemas.microsoft.com/office/drawing/2014/chartex" xmlns:cx1="http://schemas.microsoft.com/office/drawing/2015/9/8/chartex" xmlns:cx2="http://schemas.microsoft.com/office/drawing/2015/10/21/chartex" xmlns:cx3="http://schemas.microsoft.com/office/drawing/2016/5/9/chartex" xmlns:cx4="http://schemas.microsoft.com/office/drawing/2016/5/10/chartex" xmlns:cx5="http://schemas.microsoft.com/office/drawing/2016/5/11/chartex" xmlns:cx6="http://schemas.microsoft.com/office/drawing/2016/5/12/chartex" xmlns:cx7="http://schemas.microsoft.com/office/drawing/2016/5/13/chartex" xmlns:cx8="http://schemas.microsoft.com/office/drawing/2016/5/14/chartex" xmlns:mc="http://schemas.openxmlformats.org/markup-compatibility/2006" xmlns:aink="http://schemas.microsoft.com/office/drawing/2016/ink" xmlns:am3d="http://schemas.microsoft.com/office/drawing/2017/model3d" xmlns:o="urn:schemas-microsoft-com:office:office" xmlns:oel="http://schemas.microsoft.com/office/2019/extlst" xmlns:r="http://schemas.openxmlformats.org/officeDocument/2006/relationships" xmlns:m="http://schemas.openxmlformats.org/officeDocument/2006/math" xmlns:v="urn:schemas-microsoft-com:vml" xmlns:wp14="http://schemas.microsoft.com/office/word/2010/wordprocessingDrawing" xmlns:wp="http://schemas.openxmlformats.org/drawingml/2006/wordprocessingDrawing" xmlns:w10="urn:schemas-microsoft-com:office:word" xmlns:w="http://schemas.openxmlformats.org/wordprocessingml/2006/main" xmlns:w14="http://schemas.microsoft.com/office/word/2010/wordml" xmlns:w15="http://schemas.microsoft.com/office/word/2012/wordml" xmlns:w16cex="http://schemas.microsoft.com/office/word/2018/wordml/cex" xmlns:w16cid="http://schemas.microsoft.com/office/word/2016/wordml/cid" xmlns:w16="http://schemas.microsoft.com/office/word/2018/wordml" xmlns:w16du="http://schemas.microsoft.com/office/word/2023/wordml/word16du" xmlns:w16sdtdh="http://schemas.microsoft.com/office/word/2020/wordml/sdtdatahash" xmlns:w16sdtfl="http://schemas.microsoft.com/office/word/2024/wordml/sdtformatlock" xmlns:w16se="http://schemas.microsoft.com/office/word/2015/wordml/symex" xmlns:wpg="http://schemas.microsoft.com/office/word/2010/wordprocessingGroup" xmlns:wpi="http://schemas.microsoft.com/office/word/2010/wordprocessingInk" xmlns:wne="http://schemas.microsoft.com/office/word/2006/wordml" xmlns:wps="http://schemas.microsoft.com/office/word/2010/wordprocessingShape" mc:Ignorable="w14 w15 w16se w16cid w16 w16cex w16sdtdh w16sdtfl w16du wp14">
+<w:endnotes xmlns:wpc="http://schemas.microsoft.com/office/word/2010/wordprocessingCanvas" xmlns:cx="http://schemas.microsoft.com/office/drawing/2014/chartex" xmlns:cx1="http://schemas.microsoft.com/office/drawing/2015/9/8/chartex" xmlns:cx2="http://schemas.microsoft.com/office/drawing/2015/10/21/chartex" xmlns:cx3="http://schemas.microsoft.com/office/drawing/2016/5/9/chartex" xmlns:cx4="http://schemas.microsoft.com/office/drawing/2016/5/10/chartex" xmlns:cx5="http://schemas.microsoft.com/office/drawing/2016/5/11/chartex" xmlns:cx6="http://schemas.microsoft.com/office/drawing/2016/5/12/chartex" xmlns:cx7="http://schemas.microsoft.com/office/drawing/2016/5/13/chartex" xmlns:cx8="http://schemas.microsoft.com/office/drawing/2016/5/14/chartex" xmlns:mc="http://schemas.openxmlformats.org/markup-compatibility/2006" xmlns:aink="http://schemas.microsoft.com/office/drawing/2016/ink" xmlns:am3d="http://schemas.microsoft.com/office/drawing/2017/model3d" xmlns:o="urn:schemas-microsoft-com:office:office" xmlns:oel="http://schemas.microsoft.com/office/2019/extlst" xmlns:r="http://schemas.openxmlformats.org/officeDocument/2006/relationships" xmlns:m="http://schemas.openxmlformats.org/officeDocument/2006/math" xmlns:v="urn:schemas-microsoft-com:vml" xmlns:wp14="http://schemas.microsoft.com/office/word/2010/wordprocessingDrawing" xmlns:wp="http://schemas.openxmlformats.org/drawingml/2006/wordprocessingDrawing" xmlns:w10="urn:schemas-microsoft-com:office:word" xmlns:w="http://schemas.openxmlformats.org/wordprocessingml/2006/main" xmlns:w14="http://schemas.microsoft.com/office/word/2010/wordml" xmlns:w15="http://schemas.microsoft.com/office/word/2012/wordml" xmlns:w16cei="http://schemas.microsoft.com/office/word/2026/wordml/cei" xmlns:w16cex="http://schemas.microsoft.com/office/word/2018/wordml/cex" xmlns:w16cid="http://schemas.microsoft.com/office/word/2016/wordml/cid" xmlns:w16="http://schemas.microsoft.com/office/word/2018/wordml" xmlns:w16du="http://schemas.microsoft.com/office/word/2023/wordml/word16du" xmlns:w16sdtdh="http://schemas.microsoft.com/office/word/2020/wordml/sdtdatahash" xmlns:w16sdtfl="http://schemas.microsoft.com/office/word/2024/wordml/sdtformatlock" xmlns:w16se="http://schemas.microsoft.com/office/word/2015/wordml/symex" xmlns:wpg="http://schemas.microsoft.com/office/word/2010/wordprocessingGroup" xmlns:wpi="http://schemas.microsoft.com/office/word/2010/wordprocessingInk" xmlns:wne="http://schemas.microsoft.com/office/word/2006/wordml" xmlns:wps="http://schemas.microsoft.com/office/word/2010/wordprocessingShape" mc:Ignorable="w14 w15 w16se w16cid w16 w16cex w16sdtdh w16sdtfl w16du wp14">
   <w:endnote w:type="separator" w:id="-1">
     <w:p>
       <w:pPr>
@@ -923,7 +1010,7 @@
 </file>
 
 <file path=word/footnotes.xml><?xml version="1.0" encoding="utf-8"?>
-<w:footnotes xmlns:wpc="http://schemas.microsoft.com/office/word/2010/wordprocessingCanvas" xmlns:cx="http://schemas.microsoft.com/office/drawing/2014/chartex" xmlns:cx1="http://schemas.microsoft.com/office/drawing/2015/9/8/chartex" xmlns:cx2="http://schemas.microsoft.com/office/drawing/2015/10/21/chartex" xmlns:cx3="http://schemas.microsoft.com/office/drawing/2016/5/9/chartex" xmlns:cx4="http://schemas.microsoft.com/office/drawing/2016/5/10/chartex" xmlns:cx5="http://schemas.microsoft.com/office/drawing/2016/5/11/chartex" xmlns:cx6="http://schemas.microsoft.com/office/drawing/2016/5/12/chartex" xmlns:cx7="http://schemas.microsoft.com/office/drawing/2016/5/13/chartex" xmlns:cx8="http://schemas.microsoft.com/office/drawing/2016/5/14/chartex" xmlns:mc="http://schemas.openxmlformats.org/markup-compatibility/2006" xmlns:aink="http://schemas.microsoft.com/office/drawing/2016/ink" xmlns:am3d="http://schemas.microsoft.com/office/drawing/2017/model3d" xmlns:o="urn:schemas-microsoft-com:office:office" xmlns:oel="http://schemas.microsoft.com/office/2019/extlst" xmlns:r="http://schemas.openxmlformats.org/officeDocument/2006/relationships" xmlns:m="http://schemas.openxmlformats.org/officeDocument/2006/math" xmlns:v="urn:schemas-microsoft-com:vml" xmlns:wp14="http://schemas.microsoft.com/office/word/2010/wordprocessingDrawing" xmlns:wp="http://schemas.openxmlformats.org/drawingml/2006/wordprocessingDrawing" xmlns:w10="urn:schemas-microsoft-com:office:word" xmlns:w="http://schemas.openxmlformats.org/wordprocessingml/2006/main" xmlns:w14="http://schemas.microsoft.com/office/word/2010/wordml" xmlns:w15="http://schemas.microsoft.com/office/word/2012/wordml" xmlns:w16cex="http://schemas.microsoft.com/office/word/2018/wordml/cex" xmlns:w16cid="http://schemas.microsoft.com/office/word/2016/wordml/cid" xmlns:w16="http://schemas.microsoft.com/office/word/2018/wordml" xmlns:w16du="http://schemas.microsoft.com/office/word/2023/wordml/word16du" xmlns:w16sdtdh="http://schemas.microsoft.com/office/word/2020/wordml/sdtdatahash" xmlns:w16sdtfl="http://schemas.microsoft.com/office/word/2024/wordml/sdtformatlock" xmlns:w16se="http://schemas.microsoft.com/office/word/2015/wordml/symex" xmlns:wpg="http://schemas.microsoft.com/office/word/2010/wordprocessingGroup" xmlns:wpi="http://schemas.microsoft.com/office/word/2010/wordprocessingInk" xmlns:wne="http://schemas.microsoft.com/office/word/2006/wordml" xmlns:wps="http://schemas.microsoft.com/office/word/2010/wordprocessingShape" mc:Ignorable="w14 w15 w16se w16cid w16 w16cex w16sdtdh w16sdtfl w16du wp14">
+<w:footnotes xmlns:wpc="http://schemas.microsoft.com/office/word/2010/wordprocessingCanvas" xmlns:cx="http://schemas.microsoft.com/office/drawing/2014/chartex" xmlns:cx1="http://schemas.microsoft.com/office/drawing/2015/9/8/chartex" xmlns:cx2="http://schemas.microsoft.com/office/drawing/2015/10/21/chartex" xmlns:cx3="http://schemas.microsoft.com/office/drawing/2016/5/9/chartex" xmlns:cx4="http://schemas.microsoft.com/office/drawing/2016/5/10/chartex" xmlns:cx5="http://schemas.microsoft.com/office/drawing/2016/5/11/chartex" xmlns:cx6="http://schemas.microsoft.com/office/drawing/2016/5/12/chartex" xmlns:cx7="http://schemas.microsoft.com/office/drawing/2016/5/13/chartex" xmlns:cx8="http://schemas.microsoft.com/office/drawing/2016/5/14/chartex" xmlns:mc="http://schemas.openxmlformats.org/markup-compatibility/2006" xmlns:aink="http://schemas.microsoft.com/office/drawing/2016/ink" xmlns:am3d="http://schemas.microsoft.com/office/drawing/2017/model3d" xmlns:o="urn:schemas-microsoft-com:office:office" xmlns:oel="http://schemas.microsoft.com/office/2019/extlst" xmlns:r="http://schemas.openxmlformats.org/officeDocument/2006/relationships" xmlns:m="http://schemas.openxmlformats.org/officeDocument/2006/math" xmlns:v="urn:schemas-microsoft-com:vml" xmlns:wp14="http://schemas.microsoft.com/office/word/2010/wordprocessingDrawing" xmlns:wp="http://schemas.openxmlformats.org/drawingml/2006/wordprocessingDrawing" xmlns:w10="urn:schemas-microsoft-com:office:word" xmlns:w="http://schemas.openxmlformats.org/wordprocessingml/2006/main" xmlns:w14="http://schemas.microsoft.com/office/word/2010/wordml" xmlns:w15="http://schemas.microsoft.com/office/word/2012/wordml" xmlns:w16cei="http://schemas.microsoft.com/office/word/2026/wordml/cei" xmlns:w16cex="http://schemas.microsoft.com/office/word/2018/wordml/cex" xmlns:w16cid="http://schemas.microsoft.com/office/word/2016/wordml/cid" xmlns:w16="http://schemas.microsoft.com/office/word/2018/wordml" xmlns:w16du="http://schemas.microsoft.com/office/word/2023/wordml/word16du" xmlns:w16sdtdh="http://schemas.microsoft.com/office/word/2020/wordml/sdtdatahash" xmlns:w16sdtfl="http://schemas.microsoft.com/office/word/2024/wordml/sdtformatlock" xmlns:w16se="http://schemas.microsoft.com/office/word/2015/wordml/symex" xmlns:wpg="http://schemas.microsoft.com/office/word/2010/wordprocessingGroup" xmlns:wpi="http://schemas.microsoft.com/office/word/2010/wordprocessingInk" xmlns:wne="http://schemas.microsoft.com/office/word/2006/wordml" xmlns:wps="http://schemas.microsoft.com/office/word/2010/wordprocessingShape" mc:Ignorable="w14 w15 w16se w16cid w16 w16cex w16sdtdh w16sdtfl w16du wp14">
   <w:footnote w:type="separator" w:id="-1">
     <w:p>
       <w:pPr>
@@ -948,7 +1035,7 @@
 </file>
 
 <file path=word/numbering.xml><?xml version="1.0" encoding="utf-8"?>
-<w:numbering xmlns:wpc="http://schemas.microsoft.com/office/word/2010/wordprocessingCanvas" xmlns:cx="http://schemas.microsoft.com/office/drawing/2014/chartex" xmlns:cx1="http://schemas.microsoft.com/office/drawing/2015/9/8/chartex" xmlns:cx2="http://schemas.microsoft.com/office/drawing/2015/10/21/chartex" xmlns:cx3="http://schemas.microsoft.com/office/drawing/2016/5/9/chartex" xmlns:cx4="http://schemas.microsoft.com/office/drawing/2016/5/10/chartex" xmlns:cx5="http://schemas.microsoft.com/office/drawing/2016/5/11/chartex" xmlns:cx6="http://schemas.microsoft.com/office/drawing/2016/5/12/chartex" xmlns:cx7="http://schemas.microsoft.com/office/drawing/2016/5/13/chartex" xmlns:cx8="http://schemas.microsoft.com/office/drawing/2016/5/14/chartex" xmlns:mc="http://schemas.openxmlformats.org/markup-compatibility/2006" xmlns:aink="http://schemas.microsoft.com/office/drawing/2016/ink" xmlns:am3d="http://schemas.microsoft.com/office/drawing/2017/model3d" xmlns:o="urn:schemas-microsoft-com:office:office" xmlns:oel="http://schemas.microsoft.com/office/2019/extlst" xmlns:r="http://schemas.openxmlformats.org/officeDocument/2006/relationships" xmlns:m="http://schemas.openxmlformats.org/officeDocument/2006/math" xmlns:v="urn:schemas-microsoft-com:vml" xmlns:wp14="http://schemas.microsoft.com/office/word/2010/wordprocessingDrawing" xmlns:wp="http://schemas.openxmlformats.org/drawingml/2006/wordprocessingDrawing" xmlns:w10="urn:schemas-microsoft-com:office:word" xmlns:w="http://schemas.openxmlformats.org/wordprocessingml/2006/main" xmlns:w14="http://schemas.microsoft.com/office/word/2010/wordml" xmlns:w15="http://schemas.microsoft.com/office/word/2012/wordml" xmlns:w16cex="http://schemas.microsoft.com/office/word/2018/wordml/cex" xmlns:w16cid="http://schemas.microsoft.com/office/word/2016/wordml/cid" xmlns:w16="http://schemas.microsoft.com/office/word/2018/wordml" xmlns:w16du="http://schemas.microsoft.com/office/word/2023/wordml/word16du" xmlns:w16sdtdh="http://schemas.microsoft.com/office/word/2020/wordml/sdtdatahash" xmlns:w16sdtfl="http://schemas.microsoft.com/office/word/2024/wordml/sdtformatlock" xmlns:w16se="http://schemas.microsoft.com/office/word/2015/wordml/symex" xmlns:wpg="http://schemas.microsoft.com/office/word/2010/wordprocessingGroup" xmlns:wpi="http://schemas.microsoft.com/office/word/2010/wordprocessingInk" xmlns:wne="http://schemas.microsoft.com/office/word/2006/wordml" xmlns:wps="http://schemas.microsoft.com/office/word/2010/wordprocessingShape" mc:Ignorable="w14 w15 w16se w16cid w16 w16cex w16sdtdh w16sdtfl w16du wp14">
+<w:numbering xmlns:wpc="http://schemas.microsoft.com/office/word/2010/wordprocessingCanvas" xmlns:cx="http://schemas.microsoft.com/office/drawing/2014/chartex" xmlns:cx1="http://schemas.microsoft.com/office/drawing/2015/9/8/chartex" xmlns:cx2="http://schemas.microsoft.com/office/drawing/2015/10/21/chartex" xmlns:cx3="http://schemas.microsoft.com/office/drawing/2016/5/9/chartex" xmlns:cx4="http://schemas.microsoft.com/office/drawing/2016/5/10/chartex" xmlns:cx5="http://schemas.microsoft.com/office/drawing/2016/5/11/chartex" xmlns:cx6="http://schemas.microsoft.com/office/drawing/2016/5/12/chartex" xmlns:cx7="http://schemas.microsoft.com/office/drawing/2016/5/13/chartex" xmlns:cx8="http://schemas.microsoft.com/office/drawing/2016/5/14/chartex" xmlns:mc="http://schemas.openxmlformats.org/markup-compatibility/2006" xmlns:aink="http://schemas.microsoft.com/office/drawing/2016/ink" xmlns:am3d="http://schemas.microsoft.com/office/drawing/2017/model3d" xmlns:o="urn:schemas-microsoft-com:office:office" xmlns:oel="http://schemas.microsoft.com/office/2019/extlst" xmlns:r="http://schemas.openxmlformats.org/officeDocument/2006/relationships" xmlns:m="http://schemas.openxmlformats.org/officeDocument/2006/math" xmlns:v="urn:schemas-microsoft-com:vml" xmlns:wp14="http://schemas.microsoft.com/office/word/2010/wordprocessingDrawing" xmlns:wp="http://schemas.openxmlformats.org/drawingml/2006/wordprocessingDrawing" xmlns:w10="urn:schemas-microsoft-com:office:word" xmlns:w="http://schemas.openxmlformats.org/wordprocessingml/2006/main" xmlns:w14="http://schemas.microsoft.com/office/word/2010/wordml" xmlns:w15="http://schemas.microsoft.com/office/word/2012/wordml" xmlns:w16cei="http://schemas.microsoft.com/office/word/2026/wordml/cei" xmlns:w16cex="http://schemas.microsoft.com/office/word/2018/wordml/cex" xmlns:w16cid="http://schemas.microsoft.com/office/word/2016/wordml/cid" xmlns:w16="http://schemas.microsoft.com/office/word/2018/wordml" xmlns:w16du="http://schemas.microsoft.com/office/word/2023/wordml/word16du" xmlns:w16sdtdh="http://schemas.microsoft.com/office/word/2020/wordml/sdtdatahash" xmlns:w16sdtfl="http://schemas.microsoft.com/office/word/2024/wordml/sdtformatlock" xmlns:w16se="http://schemas.microsoft.com/office/word/2015/wordml/symex" xmlns:wpg="http://schemas.microsoft.com/office/word/2010/wordprocessingGroup" xmlns:wpi="http://schemas.microsoft.com/office/word/2010/wordprocessingInk" xmlns:wne="http://schemas.microsoft.com/office/word/2006/wordml" xmlns:wps="http://schemas.microsoft.com/office/word/2010/wordprocessingShape" mc:Ignorable="w14 w15 w16se w16cid w16 w16cex w16sdtdh w16sdtfl w16du wp14">
   <w:abstractNum w:abstractNumId="0" w15:restartNumberingAfterBreak="0">
     <w:nsid w:val="05FA6B69"/>
     <w:multiLevelType w:val="hybridMultilevel"/>
@@ -1580,6 +1667,119 @@
     </w:lvl>
   </w:abstractNum>
   <w:abstractNum w:abstractNumId="6" w15:restartNumberingAfterBreak="0">
+    <w:nsid w:val="68664E0B"/>
+    <w:multiLevelType w:val="hybridMultilevel"/>
+    <w:tmpl w:val="6E88F460"/>
+    <w:lvl w:ilvl="0" w:tplc="0C090001">
+      <w:start w:val="1"/>
+      <w:numFmt w:val="bullet"/>
+      <w:lvlText w:val=""/>
+      <w:lvlJc w:val="left"/>
+      <w:pPr>
+        <w:ind w:left="720" w:hanging="360"/>
+      </w:pPr>
+      <w:rPr>
+        <w:rFonts w:ascii="Symbol" w:hAnsi="Symbol" w:hint="default"/>
+      </w:rPr>
+    </w:lvl>
+    <w:lvl w:ilvl="1" w:tplc="0C090003" w:tentative="1">
+      <w:start w:val="1"/>
+      <w:numFmt w:val="bullet"/>
+      <w:lvlText w:val="o"/>
+      <w:lvlJc w:val="left"/>
+      <w:pPr>
+        <w:ind w:left="1440" w:hanging="360"/>
+      </w:pPr>
+      <w:rPr>
+        <w:rFonts w:ascii="Courier New" w:hAnsi="Courier New" w:cs="Courier New" w:hint="default"/>
+      </w:rPr>
+    </w:lvl>
+    <w:lvl w:ilvl="2" w:tplc="0C090005" w:tentative="1">
+      <w:start w:val="1"/>
+      <w:numFmt w:val="bullet"/>
+      <w:lvlText w:val=""/>
+      <w:lvlJc w:val="left"/>
+      <w:pPr>
+        <w:ind w:left="2160" w:hanging="360"/>
+      </w:pPr>
+      <w:rPr>
+        <w:rFonts w:ascii="Wingdings" w:hAnsi="Wingdings" w:hint="default"/>
+      </w:rPr>
+    </w:lvl>
+    <w:lvl w:ilvl="3" w:tplc="0C090001" w:tentative="1">
+      <w:start w:val="1"/>
+      <w:numFmt w:val="bullet"/>
+      <w:lvlText w:val=""/>
+      <w:lvlJc w:val="left"/>
+      <w:pPr>
+        <w:ind w:left="2880" w:hanging="360"/>
+      </w:pPr>
+      <w:rPr>
+        <w:rFonts w:ascii="Symbol" w:hAnsi="Symbol" w:hint="default"/>
+      </w:rPr>
+    </w:lvl>
+    <w:lvl w:ilvl="4" w:tplc="0C090003" w:tentative="1">
+      <w:start w:val="1"/>
+      <w:numFmt w:val="bullet"/>
+      <w:lvlText w:val="o"/>
+      <w:lvlJc w:val="left"/>
+      <w:pPr>
+        <w:ind w:left="3600" w:hanging="360"/>
+      </w:pPr>
+      <w:rPr>
+        <w:rFonts w:ascii="Courier New" w:hAnsi="Courier New" w:cs="Courier New" w:hint="default"/>
+      </w:rPr>
+    </w:lvl>
+    <w:lvl w:ilvl="5" w:tplc="0C090005" w:tentative="1">
+      <w:start w:val="1"/>
+      <w:numFmt w:val="bullet"/>
+      <w:lvlText w:val=""/>
+      <w:lvlJc w:val="left"/>
+      <w:pPr>
+        <w:ind w:left="4320" w:hanging="360"/>
+      </w:pPr>
+      <w:rPr>
+        <w:rFonts w:ascii="Wingdings" w:hAnsi="Wingdings" w:hint="default"/>
+      </w:rPr>
+    </w:lvl>
+    <w:lvl w:ilvl="6" w:tplc="0C090001" w:tentative="1">
+      <w:start w:val="1"/>
+      <w:numFmt w:val="bullet"/>
+      <w:lvlText w:val=""/>
+      <w:lvlJc w:val="left"/>
+      <w:pPr>
+        <w:ind w:left="5040" w:hanging="360"/>
+      </w:pPr>
+      <w:rPr>
+        <w:rFonts w:ascii="Symbol" w:hAnsi="Symbol" w:hint="default"/>
+      </w:rPr>
+    </w:lvl>
+    <w:lvl w:ilvl="7" w:tplc="0C090003" w:tentative="1">
+      <w:start w:val="1"/>
+      <w:numFmt w:val="bullet"/>
+      <w:lvlText w:val="o"/>
+      <w:lvlJc w:val="left"/>
+      <w:pPr>
+        <w:ind w:left="5760" w:hanging="360"/>
+      </w:pPr>
+      <w:rPr>
+        <w:rFonts w:ascii="Courier New" w:hAnsi="Courier New" w:cs="Courier New" w:hint="default"/>
+      </w:rPr>
+    </w:lvl>
+    <w:lvl w:ilvl="8" w:tplc="0C090005" w:tentative="1">
+      <w:start w:val="1"/>
+      <w:numFmt w:val="bullet"/>
+      <w:lvlText w:val=""/>
+      <w:lvlJc w:val="left"/>
+      <w:pPr>
+        <w:ind w:left="6480" w:hanging="360"/>
+      </w:pPr>
+      <w:rPr>
+        <w:rFonts w:ascii="Wingdings" w:hAnsi="Wingdings" w:hint="default"/>
+      </w:rPr>
+    </w:lvl>
+  </w:abstractNum>
+  <w:abstractNum w:abstractNumId="7" w15:restartNumberingAfterBreak="0">
     <w:nsid w:val="77B65714"/>
     <w:multiLevelType w:val="hybridMultilevel"/>
     <w:tmpl w:val="CAD87A04"/>
@@ -1702,7 +1902,7 @@
     <w:abstractNumId w:val="3"/>
   </w:num>
   <w:num w:numId="4" w16cid:durableId="32929178">
-    <w:abstractNumId w:val="6"/>
+    <w:abstractNumId w:val="7"/>
   </w:num>
   <w:num w:numId="5" w16cid:durableId="1507329311">
     <w:abstractNumId w:val="1"/>
@@ -1712,6 +1912,9 @@
   </w:num>
   <w:num w:numId="7" w16cid:durableId="868495976">
     <w:abstractNumId w:val="0"/>
+  </w:num>
+  <w:num w:numId="8" w16cid:durableId="1171068257">
+    <w:abstractNumId w:val="6"/>
   </w:num>
 </w:numbering>
 </file>
@@ -2691,6 +2894,112 @@
     <w:uiPriority w:val="99"/>
     <w:rsid w:val="008C02C1"/>
   </w:style>
+  <w:style w:type="character" w:styleId="BookTitle">
+    <w:name w:val="Book Title"/>
+    <w:basedOn w:val="DefaultParagraphFont"/>
+    <w:uiPriority w:val="33"/>
+    <w:qFormat/>
+    <w:rsid w:val="00E04AE2"/>
+    <w:rPr>
+      <w:b/>
+      <w:bCs/>
+      <w:i/>
+      <w:iCs/>
+      <w:spacing w:val="5"/>
+    </w:rPr>
+  </w:style>
+  <w:style w:type="paragraph" w:styleId="Caption">
+    <w:name w:val="caption"/>
+    <w:basedOn w:val="Normal"/>
+    <w:next w:val="Normal"/>
+    <w:uiPriority w:val="35"/>
+    <w:semiHidden/>
+    <w:unhideWhenUsed/>
+    <w:qFormat/>
+    <w:rsid w:val="00E04AE2"/>
+    <w:pPr>
+      <w:spacing w:after="200" w:line="240" w:lineRule="auto"/>
+    </w:pPr>
+    <w:rPr>
+      <w:i/>
+      <w:iCs/>
+      <w:color w:val="0E2841" w:themeColor="text2"/>
+      <w:sz w:val="18"/>
+      <w:szCs w:val="18"/>
+    </w:rPr>
+  </w:style>
+  <w:style w:type="character" w:styleId="Emphasis">
+    <w:name w:val="Emphasis"/>
+    <w:basedOn w:val="DefaultParagraphFont"/>
+    <w:uiPriority w:val="20"/>
+    <w:qFormat/>
+    <w:rsid w:val="00E04AE2"/>
+    <w:rPr>
+      <w:i/>
+      <w:iCs/>
+    </w:rPr>
+  </w:style>
+  <w:style w:type="paragraph" w:styleId="NoSpacing">
+    <w:name w:val="No Spacing"/>
+    <w:uiPriority w:val="1"/>
+    <w:qFormat/>
+    <w:rsid w:val="00E04AE2"/>
+    <w:pPr>
+      <w:spacing w:after="0" w:line="240" w:lineRule="auto"/>
+    </w:pPr>
+  </w:style>
+  <w:style w:type="character" w:styleId="Strong">
+    <w:name w:val="Strong"/>
+    <w:basedOn w:val="DefaultParagraphFont"/>
+    <w:uiPriority w:val="22"/>
+    <w:qFormat/>
+    <w:rsid w:val="00E04AE2"/>
+    <w:rPr>
+      <w:b/>
+      <w:bCs/>
+    </w:rPr>
+  </w:style>
+  <w:style w:type="character" w:styleId="SubtleEmphasis">
+    <w:name w:val="Subtle Emphasis"/>
+    <w:basedOn w:val="DefaultParagraphFont"/>
+    <w:uiPriority w:val="19"/>
+    <w:qFormat/>
+    <w:rsid w:val="00E04AE2"/>
+    <w:rPr>
+      <w:i/>
+      <w:iCs/>
+      <w:color w:val="404040" w:themeColor="text1" w:themeTint="BF"/>
+    </w:rPr>
+  </w:style>
+  <w:style w:type="character" w:styleId="SubtleReference">
+    <w:name w:val="Subtle Reference"/>
+    <w:basedOn w:val="DefaultParagraphFont"/>
+    <w:uiPriority w:val="31"/>
+    <w:qFormat/>
+    <w:rsid w:val="00E04AE2"/>
+    <w:rPr>
+      <w:smallCaps/>
+      <w:color w:val="5A5A5A" w:themeColor="text1" w:themeTint="A5"/>
+    </w:rPr>
+  </w:style>
+  <w:style w:type="paragraph" w:styleId="TOCHeading">
+    <w:name w:val="TOC Heading"/>
+    <w:basedOn w:val="Heading1"/>
+    <w:next w:val="Normal"/>
+    <w:uiPriority w:val="39"/>
+    <w:semiHidden/>
+    <w:unhideWhenUsed/>
+    <w:qFormat/>
+    <w:rsid w:val="00E04AE2"/>
+    <w:pPr>
+      <w:spacing w:before="240" w:after="0"/>
+      <w:outlineLvl w:val="9"/>
+    </w:pPr>
+    <w:rPr>
+      <w:sz w:val="32"/>
+      <w:szCs w:val="32"/>
+    </w:rPr>
+  </w:style>
 </w:styles>
 </file>
 

</xml_diff>